<commit_message>
feat(amelie-v0.8.0): add DOCX TOC
</commit_message>
<xml_diff>
--- a/README.docx
+++ b/README.docx
@@ -20,7 +20,7 @@
           <w:b/>
           <w:sz w:val="56"/>
         </w:rPr>
-        <w:t>Amelie MD v0.7.2</w:t>
+        <w:t>Amelie MD v0.8</w:t>
       </w:r>
     </w:p>
     <w:p>
@@ -56,6 +56,28 @@
         <w:t>2026-04-29</w:t>
       </w:r>
     </w:p>
+    <w:p>
+      <w:r>
+        <w:br w:type="page"/>
+      </w:r>
+    </w:p>
+    <w:p>
+      <w:pPr>
+        <w:pStyle w:val="Heading1"/>
+      </w:pPr>
+      <w:r>
+        <w:t>Table of Contents</w:t>
+      </w:r>
+    </w:p>
+    <w:p>
+      <w:r>
+        <w:fldChar w:fldCharType="begin"/>
+        <w:instrText xml:space="preserve">TOC \o "1-3" \h \z \u</w:instrText>
+        <w:fldChar w:fldCharType="separate"/>
+        <w:fldChar w:fldCharType="end"/>
+      </w:r>
+    </w:p>
+    <w:p/>
     <w:p>
       <w:r>
         <w:br w:type="page"/>

</xml_diff>

<commit_message>
feat(amelie-v0.8.0): add DOCX TOC (#13)
</commit_message>
<xml_diff>
--- a/README.docx
+++ b/README.docx
@@ -20,7 +20,7 @@
           <w:b/>
           <w:sz w:val="56"/>
         </w:rPr>
-        <w:t>Amelie MD v0.7.2</w:t>
+        <w:t>Amelie MD v0.8</w:t>
       </w:r>
     </w:p>
     <w:p>
@@ -56,6 +56,28 @@
         <w:t>2026-04-29</w:t>
       </w:r>
     </w:p>
+    <w:p>
+      <w:r>
+        <w:br w:type="page"/>
+      </w:r>
+    </w:p>
+    <w:p>
+      <w:pPr>
+        <w:pStyle w:val="Heading1"/>
+      </w:pPr>
+      <w:r>
+        <w:t>Table of Contents</w:t>
+      </w:r>
+    </w:p>
+    <w:p>
+      <w:r>
+        <w:fldChar w:fldCharType="begin"/>
+        <w:instrText xml:space="preserve">TOC \o "1-3" \h \z \u</w:instrText>
+        <w:fldChar w:fldCharType="separate"/>
+        <w:fldChar w:fldCharType="end"/>
+      </w:r>
+    </w:p>
+    <w:p/>
     <w:p>
       <w:r>
         <w:br w:type="page"/>

</xml_diff>

<commit_message>
feat(amelie-v0.8.1): add TOC + heading numbering
</commit_message>
<xml_diff>
--- a/README.docx
+++ b/README.docx
@@ -20,7 +20,7 @@
           <w:b/>
           <w:sz w:val="56"/>
         </w:rPr>
-        <w:t>Amelie MD v0.8</w:t>
+        <w:t>Amelie MD v0.8.1</w:t>
       </w:r>
     </w:p>
     <w:p>
@@ -62,10 +62,12 @@
       </w:r>
     </w:p>
     <w:p>
-      <w:pPr>
-        <w:pStyle w:val="Heading1"/>
-      </w:pPr>
       <w:r>
+        <w:rPr>
+          <w:b/>
+          <w:color w:val="003366"/>
+          <w:sz w:val="40"/>
+        </w:rPr>
         <w:t>Table of Contents</w:t>
       </w:r>
     </w:p>
@@ -74,6 +76,14 @@
         <w:fldChar w:fldCharType="begin"/>
         <w:instrText xml:space="preserve">TOC \o "1-3" \h \z \u</w:instrText>
         <w:fldChar w:fldCharType="separate"/>
+      </w:r>
+      <w:r>
+        <w:rPr>
+          <w:i/>
+        </w:rPr>
+        <w:t>Right-click and update field to generate table of contents</w:t>
+      </w:r>
+      <w:r>
         <w:fldChar w:fldCharType="end"/>
       </w:r>
     </w:p>
@@ -87,6 +97,9 @@
       <w:pPr>
         <w:pStyle w:val="Heading1"/>
       </w:pPr>
+      <w:r>
+        <w:t xml:space="preserve">1 </w:t>
+      </w:r>
       <w:r>
         <w:rPr>
           <w:b w:val="0"/>

</xml_diff>

<commit_message>
feat(amelie-v0.8.1): add TOC + heading numbering (#14)
</commit_message>
<xml_diff>
--- a/README.docx
+++ b/README.docx
@@ -20,7 +20,7 @@
           <w:b/>
           <w:sz w:val="56"/>
         </w:rPr>
-        <w:t>Amelie MD v0.8</w:t>
+        <w:t>Amelie MD v0.8.1</w:t>
       </w:r>
     </w:p>
     <w:p>
@@ -62,10 +62,12 @@
       </w:r>
     </w:p>
     <w:p>
-      <w:pPr>
-        <w:pStyle w:val="Heading1"/>
-      </w:pPr>
       <w:r>
+        <w:rPr>
+          <w:b/>
+          <w:color w:val="003366"/>
+          <w:sz w:val="40"/>
+        </w:rPr>
         <w:t>Table of Contents</w:t>
       </w:r>
     </w:p>
@@ -74,6 +76,14 @@
         <w:fldChar w:fldCharType="begin"/>
         <w:instrText xml:space="preserve">TOC \o "1-3" \h \z \u</w:instrText>
         <w:fldChar w:fldCharType="separate"/>
+      </w:r>
+      <w:r>
+        <w:rPr>
+          <w:i/>
+        </w:rPr>
+        <w:t>Right-click and update field to generate table of contents</w:t>
+      </w:r>
+      <w:r>
         <w:fldChar w:fldCharType="end"/>
       </w:r>
     </w:p>
@@ -87,6 +97,9 @@
       <w:pPr>
         <w:pStyle w:val="Heading1"/>
       </w:pPr>
+      <w:r>
+        <w:t xml:space="preserve">1 </w:t>
+      </w:r>
       <w:r>
         <w:rPr>
           <w:b w:val="0"/>

</xml_diff>

<commit_message>
feat(amelie-v0.9): add Word-native heading numbering
</commit_message>
<xml_diff>
--- a/README.docx
+++ b/README.docx
@@ -20,7 +20,7 @@
           <w:b/>
           <w:sz w:val="56"/>
         </w:rPr>
-        <w:t>Amelie MD v0.8.1</w:t>
+        <w:t>Amelie MD v0.9</w:t>
       </w:r>
     </w:p>
     <w:p>
@@ -96,10 +96,11 @@
     <w:p>
       <w:pPr>
         <w:pStyle w:val="Heading1"/>
+        <w:numPr>
+          <w:ilvl w:val="0"/>
+          <w:numId w:val="10"/>
+        </w:numPr>
       </w:pPr>
-      <w:r>
-        <w:t xml:space="preserve">1 </w:t>
-      </w:r>
       <w:r>
         <w:rPr>
           <w:b w:val="0"/>
@@ -109,13 +110,83 @@
       </w:r>
     </w:p>
     <w:p>
-      <w:pPr/>
+      <w:pPr>
+        <w:pStyle w:val="Heading2"/>
+        <w:numPr>
+          <w:ilvl w:val="1"/>
+          <w:numId w:val="10"/>
+        </w:numPr>
+      </w:pPr>
       <w:r>
         <w:rPr>
           <w:b w:val="0"/>
           <w:i w:val="0"/>
         </w:rPr>
-        <w:t>Markdown publishing toolkit for academic, technical, and data-driven documents.</w:t>
+        <w:t>Overview</w:t>
+      </w:r>
+    </w:p>
+    <w:p>
+      <w:pPr>
+        <w:pStyle w:val="Heading3"/>
+        <w:numPr>
+          <w:ilvl w:val="2"/>
+          <w:numId w:val="10"/>
+        </w:numPr>
+      </w:pPr>
+      <w:r>
+        <w:rPr>
+          <w:b w:val="0"/>
+          <w:i w:val="0"/>
+        </w:rPr>
+        <w:t>Goals</w:t>
+      </w:r>
+    </w:p>
+    <w:p>
+      <w:pPr>
+        <w:pStyle w:val="Heading2"/>
+        <w:numPr>
+          <w:ilvl w:val="1"/>
+          <w:numId w:val="10"/>
+        </w:numPr>
+      </w:pPr>
+      <w:r>
+        <w:rPr>
+          <w:b w:val="0"/>
+          <w:i w:val="0"/>
+        </w:rPr>
+        <w:t>Features</w:t>
+      </w:r>
+    </w:p>
+    <w:p>
+      <w:pPr>
+        <w:pStyle w:val="Heading3"/>
+        <w:numPr>
+          <w:ilvl w:val="2"/>
+          <w:numId w:val="10"/>
+        </w:numPr>
+      </w:pPr>
+      <w:r>
+        <w:rPr>
+          <w:b w:val="0"/>
+          <w:i w:val="0"/>
+        </w:rPr>
+        <w:t>DOCX Export</w:t>
+      </w:r>
+    </w:p>
+    <w:p>
+      <w:pPr>
+        <w:pStyle w:val="Heading3"/>
+        <w:numPr>
+          <w:ilvl w:val="2"/>
+          <w:numId w:val="10"/>
+        </w:numPr>
+      </w:pPr>
+      <w:r>
+        <w:rPr>
+          <w:b w:val="0"/>
+          <w:i w:val="0"/>
+        </w:rPr>
+        <w:t>HTML Export</w:t>
       </w:r>
     </w:p>
     <w:sectPr>
@@ -327,6 +398,39 @@
   </w:num>
   <w:num w:numId="9">
     <w:abstractNumId w:val="0"/>
+  </w:num>
+  <w:abstractNum w:abstractNumId="9">
+    <w:multiLevelType w:val="multilevel"/>
+    <w:lvl w:ilvl="0">
+      <w:start w:val="1"/>
+      <w:numFmt w:val="decimal"/>
+      <w:lvlText w:val="%1"/>
+      <w:lvlJc w:val="left"/>
+      <w:pPr>
+        <w:ind w:left="0" w:hanging="0"/>
+      </w:pPr>
+    </w:lvl>
+    <w:lvl w:ilvl="1">
+      <w:start w:val="1"/>
+      <w:numFmt w:val="decimal"/>
+      <w:lvlText w:val="%1.%2"/>
+      <w:lvlJc w:val="left"/>
+      <w:pPr>
+        <w:ind w:left="360" w:hanging="0"/>
+      </w:pPr>
+    </w:lvl>
+    <w:lvl w:ilvl="2">
+      <w:start w:val="1"/>
+      <w:numFmt w:val="decimal"/>
+      <w:lvlText w:val="%1.%2.%3"/>
+      <w:lvlJc w:val="left"/>
+      <w:pPr>
+        <w:ind w:left="720" w:hanging="0"/>
+      </w:pPr>
+    </w:lvl>
+  </w:abstractNum>
+  <w:num w:numId="10">
+    <w:abstractNumId w:val="9"/>
   </w:num>
 </w:numbering>
 </file>

</xml_diff>